<commit_message>
Report: Clean document formatting for merging
</commit_message>
<xml_diff>
--- a/Report/Task 2.docx
+++ b/Report/Task 2.docx
@@ -1,1071 +1,35 @@
 
 <file path=word/document.xml><?xml version="1.0" encoding="utf-8"?>
-<w:document xmlns:wpc="http://schemas.microsoft.com/office/word/2010/wordprocessingCanvas" xmlns:cx="http://schemas.microsoft.com/office/drawing/2014/chartex" xmlns:cx1="http://schemas.microsoft.com/office/drawing/2015/9/8/chartex" xmlns:cx2="http://schemas.microsoft.com/office/drawing/2015/10/21/chartex" xmlns:cx3="http://schemas.microsoft.com/office/drawing/2016/5/9/chartex" xmlns:cx4="http://schemas.microsoft.com/office/drawing/2016/5/10/chartex" xmlns:cx5="http://schemas.microsoft.com/office/drawing/2016/5/11/chartex" xmlns:cx6="http://schemas.microsoft.com/office/drawing/2016/5/12/chartex" xmlns:cx7="http://schemas.microsoft.com/office/drawing/2016/5/13/chartex" xmlns:cx8="http://schemas.microsoft.com/office/drawing/2016/5/14/chartex" xmlns:mc="http://schemas.openxmlformats.org/markup-compatibility/2006" xmlns:aink="http://schemas.microsoft.com/office/drawing/2016/ink" xmlns:am3d="http://schemas.microsoft.com/office/drawing/2017/model3d" xmlns:o="urn:schemas-microsoft-com:office:office" xmlns:oel="http://schemas.microsoft.com/office/2019/extlst" xmlns:r="http://schemas.openxmlformats.org/officeDocument/2006/relationships" xmlns:m="http://schemas.openxmlformats.org/officeDocument/2006/math" xmlns:v="urn:schemas-microsoft-com:vml" xmlns:wp14="http://schemas.microsoft.com/office/word/2010/wordprocessingDrawing" xmlns:wp="http://schemas.openxmlformats.org/drawingml/2006/wordprocessingDrawing" xmlns:w10="urn:schemas-microsoft-com:office:word" xmlns:w="http://schemas.openxmlformats.org/wordprocessingml/2006/main" xmlns:w14="http://schemas.microsoft.com/office/word/2010/wordml" xmlns:w15="http://schemas.microsoft.com/office/word/2012/wordml" xmlns:w16cex="http://schemas.microsoft.com/office/word/2018/wordml/cex" xmlns:w16cid="http://schemas.microsoft.com/office/word/2016/wordml/cid" xmlns:w16="http://schemas.microsoft.com/office/word/2018/wordml" xmlns:w16du="http://schemas.microsoft.com/office/word/2023/wordml/word16du" xmlns:w16sdtdh="http://schemas.microsoft.com/office/word/2020/wordml/sdtdatahash" xmlns:w16sdtfl="http://schemas.microsoft.com/office/word/2024/wordml/sdtformatlock" xmlns:w16se="http://schemas.microsoft.com/office/word/2015/wordml/symex" xmlns:wpg="http://schemas.microsoft.com/office/word/2010/wordprocessingGroup" xmlns:wpi="http://schemas.microsoft.com/office/word/2010/wordprocessingInk" xmlns:wne="http://schemas.microsoft.com/office/word/2006/wordml" xmlns:wps="http://schemas.microsoft.com/office/word/2010/wordprocessingShape" mc:Ignorable="w14 w15 w16se w16cid w16 w16cex w16sdtdh w16sdtfl w16du wp14">
+<w:document xmlns:wpc="http://schemas.microsoft.com/office/word/2010/wordprocessingCanvas" xmlns:cx="http://schemas.microsoft.com/office/drawing/2014/chartex" xmlns:cx1="http://schemas.microsoft.com/office/drawing/2015/9/8/chartex" xmlns:cx2="http://schemas.microsoft.com/office/drawing/2015/10/21/chartex" xmlns:cx3="http://schemas.microsoft.com/office/drawing/2016/5/9/chartex" xmlns:cx4="http://schemas.microsoft.com/office/drawing/2016/5/10/chartex" xmlns:cx5="http://schemas.microsoft.com/office/drawing/2016/5/11/chartex" xmlns:cx6="http://schemas.microsoft.com/office/drawing/2016/5/12/chartex" xmlns:cx7="http://schemas.microsoft.com/office/drawing/2016/5/13/chartex" xmlns:cx8="http://schemas.microsoft.com/office/drawing/2016/5/14/chartex" xmlns:mc="http://schemas.openxmlformats.org/markup-compatibility/2006" xmlns:aink="http://schemas.microsoft.com/office/drawing/2016/ink" xmlns:am3d="http://schemas.microsoft.com/office/drawing/2017/model3d" xmlns:o="urn:schemas-microsoft-com:office:office" xmlns:oel="http://schemas.microsoft.com/office/2019/extlst" xmlns:r="http://schemas.openxmlformats.org/officeDocument/2006/relationships" xmlns:m="http://schemas.openxmlformats.org/officeDocument/2006/math" xmlns:v="urn:schemas-microsoft-com:vml" xmlns:wp14="http://schemas.microsoft.com/office/word/2010/wordprocessingDrawing" xmlns:wp="http://schemas.openxmlformats.org/drawingml/2006/wordprocessingDrawing" xmlns:w10="urn:schemas-microsoft-com:office:word" xmlns:w="http://schemas.openxmlformats.org/wordprocessingml/2006/main" xmlns:w14="http://schemas.microsoft.com/office/word/2010/wordml" xmlns:w15="http://schemas.microsoft.com/office/word/2012/wordml" xmlns:w16cex="http://schemas.microsoft.com/office/word/2018/wordml/cex" xmlns:w16cid="http://schemas.microsoft.com/office/word/2016/wordml/cid" xmlns:w16="http://schemas.microsoft.com/office/word/2018/wordml" xmlns:w16du="http://schemas.microsoft.com/office/word/2023/wordml/word16du" xmlns:w16sdtdh="http://schemas.microsoft.com/office/word/2020/wordml/sdtdatahash" xmlns:w16se="http://schemas.microsoft.com/office/word/2015/wordml/symex" xmlns:wpg="http://schemas.microsoft.com/office/word/2010/wordprocessingGroup" xmlns:wpi="http://schemas.microsoft.com/office/word/2010/wordprocessingInk" xmlns:wne="http://schemas.microsoft.com/office/word/2006/wordml" xmlns:wps="http://schemas.microsoft.com/office/word/2010/wordprocessingShape" mc:Ignorable="w14 w15 w16se w16cid w16 w16cex w16sdtdh wp14">
   <w:body>
     <w:p>
       <w:pPr>
         <w:ind w:left="0"/>
       </w:pPr>
     </w:p>
-    <w:bookmarkStart w:id="0" w:name="_Toc217598120" w:displacedByCustomXml="next"/>
-    <w:bookmarkStart w:id="1" w:name="_Toc217532936" w:displacedByCustomXml="next"/>
-    <w:sdt>
-      <w:sdtPr>
-        <w:rPr>
-          <w:rFonts w:ascii="Aptos Serif" w:eastAsia="Times New Roman" w:hAnsi="Aptos Serif" w:cs="Aptos Serif"/>
-          <w:b w:val="0"/>
-          <w:bCs w:val="0"/>
-          <w:color w:val="auto"/>
-          <w:sz w:val="24"/>
-          <w:szCs w:val="24"/>
-        </w:rPr>
-        <w:id w:val="954519875"/>
-        <w:docPartObj>
-          <w:docPartGallery w:val="Table of Contents"/>
-          <w:docPartUnique/>
-        </w:docPartObj>
-      </w:sdtPr>
-      <w:sdtEndPr>
-        <w:rPr>
-          <w:noProof/>
-        </w:rPr>
-      </w:sdtEndPr>
-      <w:sdtContent>
-        <w:p>
-          <w:pPr>
-            <w:pStyle w:val="TOCHeading"/>
-          </w:pPr>
-          <w:r>
-            <w:t>Contents</w:t>
-          </w:r>
-        </w:p>
-        <w:p>
-          <w:pPr>
-            <w:pStyle w:val="TOC1"/>
-            <w:rPr>
-              <w:rFonts w:asciiTheme="minorHAnsi" w:eastAsiaTheme="minorEastAsia" w:hAnsiTheme="minorHAnsi" w:cstheme="minorBidi"/>
-              <w:kern w:val="2"/>
-              <w:sz w:val="24"/>
-              <w:szCs w:val="24"/>
-              <w14:ligatures w14:val="standardContextual"/>
-            </w:rPr>
-          </w:pPr>
-          <w:r>
-            <w:fldChar w:fldCharType="begin"/>
-          </w:r>
-          <w:r>
-            <w:instrText xml:space="preserve"> TOC \o "1-3" \h \z \u </w:instrText>
-          </w:r>
-          <w:r>
-            <w:fldChar w:fldCharType="separate"/>
-          </w:r>
-          <w:hyperlink w:anchor="_Toc226693030" w:history="1">
-            <w:r>
-              <w:rPr>
-                <w:rStyle w:val="Hyperlink"/>
-              </w:rPr>
-              <w:t>Task 2 - Knight’s Tour Problem</w:t>
-            </w:r>
-            <w:r>
-              <w:rPr>
-                <w:webHidden/>
-              </w:rPr>
-              <w:tab/>
-            </w:r>
-            <w:r>
-              <w:rPr>
-                <w:webHidden/>
-              </w:rPr>
-              <w:fldChar w:fldCharType="begin"/>
-            </w:r>
-            <w:r>
-              <w:rPr>
-                <w:webHidden/>
-              </w:rPr>
-              <w:instrText xml:space="preserve"> PAGEREF _Toc226693030 \h </w:instrText>
-            </w:r>
-            <w:r>
-              <w:rPr>
-                <w:webHidden/>
-              </w:rPr>
-            </w:r>
-            <w:r>
-              <w:rPr>
-                <w:webHidden/>
-              </w:rPr>
-              <w:fldChar w:fldCharType="separate"/>
-            </w:r>
-            <w:r>
-              <w:rPr>
-                <w:webHidden/>
-              </w:rPr>
-              <w:t>2</w:t>
-            </w:r>
-            <w:r>
-              <w:rPr>
-                <w:webHidden/>
-              </w:rPr>
-              <w:fldChar w:fldCharType="end"/>
-            </w:r>
-          </w:hyperlink>
-        </w:p>
-        <w:p>
-          <w:pPr>
-            <w:pStyle w:val="TOC2"/>
-            <w:rPr>
-              <w:rFonts w:asciiTheme="minorHAnsi" w:eastAsiaTheme="minorEastAsia" w:hAnsiTheme="minorHAnsi" w:cstheme="minorBidi"/>
-              <w:b w:val="0"/>
-              <w:bCs w:val="0"/>
-              <w:kern w:val="2"/>
-              <w:lang w:bidi="ar-SA"/>
-              <w14:ligatures w14:val="standardContextual"/>
-            </w:rPr>
-          </w:pPr>
-          <w:hyperlink w:anchor="_Toc226693031" w:history="1">
-            <w:r>
-              <w:rPr>
-                <w:rStyle w:val="Hyperlink"/>
-              </w:rPr>
-              <w:t>Background</w:t>
-            </w:r>
-            <w:r>
-              <w:rPr>
-                <w:webHidden/>
-              </w:rPr>
-              <w:tab/>
-            </w:r>
-            <w:r>
-              <w:rPr>
-                <w:webHidden/>
-              </w:rPr>
-              <w:fldChar w:fldCharType="begin"/>
-            </w:r>
-            <w:r>
-              <w:rPr>
-                <w:webHidden/>
-              </w:rPr>
-              <w:instrText xml:space="preserve"> PAGEREF _Toc226693031 \h </w:instrText>
-            </w:r>
-            <w:r>
-              <w:rPr>
-                <w:webHidden/>
-              </w:rPr>
-            </w:r>
-            <w:r>
-              <w:rPr>
-                <w:webHidden/>
-              </w:rPr>
-              <w:fldChar w:fldCharType="separate"/>
-            </w:r>
-            <w:r>
-              <w:rPr>
-                <w:webHidden/>
-              </w:rPr>
-              <w:t>2</w:t>
-            </w:r>
-            <w:r>
-              <w:rPr>
-                <w:webHidden/>
-              </w:rPr>
-              <w:fldChar w:fldCharType="end"/>
-            </w:r>
-          </w:hyperlink>
-        </w:p>
-        <w:p>
-          <w:pPr>
-            <w:pStyle w:val="TOC2"/>
-            <w:rPr>
-              <w:rFonts w:asciiTheme="minorHAnsi" w:eastAsiaTheme="minorEastAsia" w:hAnsiTheme="minorHAnsi" w:cstheme="minorBidi"/>
-              <w:b w:val="0"/>
-              <w:bCs w:val="0"/>
-              <w:kern w:val="2"/>
-              <w:lang w:bidi="ar-SA"/>
-              <w14:ligatures w14:val="standardContextual"/>
-            </w:rPr>
-          </w:pPr>
-          <w:hyperlink w:anchor="_Toc226693032" w:history="1">
-            <w:r>
-              <w:rPr>
-                <w:rStyle w:val="Hyperlink"/>
-              </w:rPr>
-              <w:t>Task Statement</w:t>
-            </w:r>
-            <w:r>
-              <w:rPr>
-                <w:webHidden/>
-              </w:rPr>
-              <w:tab/>
-            </w:r>
-            <w:r>
-              <w:rPr>
-                <w:webHidden/>
-              </w:rPr>
-              <w:fldChar w:fldCharType="begin"/>
-            </w:r>
-            <w:r>
-              <w:rPr>
-                <w:webHidden/>
-              </w:rPr>
-              <w:instrText xml:space="preserve"> PAGEREF _Toc226693032 \h </w:instrText>
-            </w:r>
-            <w:r>
-              <w:rPr>
-                <w:webHidden/>
-              </w:rPr>
-            </w:r>
-            <w:r>
-              <w:rPr>
-                <w:webHidden/>
-              </w:rPr>
-              <w:fldChar w:fldCharType="separate"/>
-            </w:r>
-            <w:r>
-              <w:rPr>
-                <w:webHidden/>
-              </w:rPr>
-              <w:t>2</w:t>
-            </w:r>
-            <w:r>
-              <w:rPr>
-                <w:webHidden/>
-              </w:rPr>
-              <w:fldChar w:fldCharType="end"/>
-            </w:r>
-          </w:hyperlink>
-        </w:p>
-        <w:p>
-          <w:pPr>
-            <w:pStyle w:val="TOC2"/>
-            <w:rPr>
-              <w:rFonts w:asciiTheme="minorHAnsi" w:eastAsiaTheme="minorEastAsia" w:hAnsiTheme="minorHAnsi" w:cstheme="minorBidi"/>
-              <w:b w:val="0"/>
-              <w:bCs w:val="0"/>
-              <w:kern w:val="2"/>
-              <w:lang w:bidi="ar-SA"/>
-              <w14:ligatures w14:val="standardContextual"/>
-            </w:rPr>
-          </w:pPr>
-          <w:hyperlink w:anchor="_Toc226693033" w:history="1">
-            <w:r>
-              <w:rPr>
-                <w:rStyle w:val="Hyperlink"/>
-              </w:rPr>
-              <w:t>Implemented Key Features</w:t>
-            </w:r>
-            <w:r>
-              <w:rPr>
-                <w:webHidden/>
-              </w:rPr>
-              <w:tab/>
-            </w:r>
-            <w:r>
-              <w:rPr>
-                <w:webHidden/>
-              </w:rPr>
-              <w:fldChar w:fldCharType="begin"/>
-            </w:r>
-            <w:r>
-              <w:rPr>
-                <w:webHidden/>
-              </w:rPr>
-              <w:instrText xml:space="preserve"> PAGEREF _Toc226693033 \h </w:instrText>
-            </w:r>
-            <w:r>
-              <w:rPr>
-                <w:webHidden/>
-              </w:rPr>
-            </w:r>
-            <w:r>
-              <w:rPr>
-                <w:webHidden/>
-              </w:rPr>
-              <w:fldChar w:fldCharType="separate"/>
-            </w:r>
-            <w:r>
-              <w:rPr>
-                <w:webHidden/>
-              </w:rPr>
-              <w:t>2</w:t>
-            </w:r>
-            <w:r>
-              <w:rPr>
-                <w:webHidden/>
-              </w:rPr>
-              <w:fldChar w:fldCharType="end"/>
-            </w:r>
-          </w:hyperlink>
-        </w:p>
-        <w:p>
-          <w:pPr>
-            <w:pStyle w:val="TOC2"/>
-            <w:rPr>
-              <w:rFonts w:asciiTheme="minorHAnsi" w:eastAsiaTheme="minorEastAsia" w:hAnsiTheme="minorHAnsi" w:cstheme="minorBidi"/>
-              <w:b w:val="0"/>
-              <w:bCs w:val="0"/>
-              <w:kern w:val="2"/>
-              <w:lang w:bidi="ar-SA"/>
-              <w14:ligatures w14:val="standardContextual"/>
-            </w:rPr>
-          </w:pPr>
-          <w:hyperlink w:anchor="_Toc226693034" w:history="1">
-            <w:r>
-              <w:rPr>
-                <w:rStyle w:val="Hyperlink"/>
-              </w:rPr>
-              <w:t>Comprehensive Description</w:t>
-            </w:r>
-            <w:r>
-              <w:rPr>
-                <w:webHidden/>
-              </w:rPr>
-              <w:tab/>
-            </w:r>
-            <w:r>
-              <w:rPr>
-                <w:webHidden/>
-              </w:rPr>
-              <w:fldChar w:fldCharType="begin"/>
-            </w:r>
-            <w:r>
-              <w:rPr>
-                <w:webHidden/>
-              </w:rPr>
-              <w:instrText xml:space="preserve"> PAGEREF _Toc226693034 \h </w:instrText>
-            </w:r>
-            <w:r>
-              <w:rPr>
-                <w:webHidden/>
-              </w:rPr>
-            </w:r>
-            <w:r>
-              <w:rPr>
-                <w:webHidden/>
-              </w:rPr>
-              <w:fldChar w:fldCharType="separate"/>
-            </w:r>
-            <w:r>
-              <w:rPr>
-                <w:webHidden/>
-              </w:rPr>
-              <w:t>3</w:t>
-            </w:r>
-            <w:r>
-              <w:rPr>
-                <w:webHidden/>
-              </w:rPr>
-              <w:fldChar w:fldCharType="end"/>
-            </w:r>
-          </w:hyperlink>
-        </w:p>
-        <w:p>
-          <w:pPr>
-            <w:pStyle w:val="TOC2"/>
-            <w:rPr>
-              <w:rFonts w:asciiTheme="minorHAnsi" w:eastAsiaTheme="minorEastAsia" w:hAnsiTheme="minorHAnsi" w:cstheme="minorBidi"/>
-              <w:b w:val="0"/>
-              <w:bCs w:val="0"/>
-              <w:kern w:val="2"/>
-              <w:lang w:bidi="ar-SA"/>
-              <w14:ligatures w14:val="standardContextual"/>
-            </w:rPr>
-          </w:pPr>
-          <w:hyperlink w:anchor="_Toc226693035" w:history="1">
-            <w:r>
-              <w:rPr>
-                <w:rStyle w:val="Hyperlink"/>
-              </w:rPr>
-              <w:t>Problem Solution</w:t>
-            </w:r>
-            <w:r>
-              <w:rPr>
-                <w:webHidden/>
-              </w:rPr>
-              <w:tab/>
-            </w:r>
-            <w:r>
-              <w:rPr>
-                <w:webHidden/>
-              </w:rPr>
-              <w:fldChar w:fldCharType="begin"/>
-            </w:r>
-            <w:r>
-              <w:rPr>
-                <w:webHidden/>
-              </w:rPr>
-              <w:instrText xml:space="preserve"> PAGEREF _Toc226693035 \h </w:instrText>
-            </w:r>
-            <w:r>
-              <w:rPr>
-                <w:webHidden/>
-              </w:rPr>
-            </w:r>
-            <w:r>
-              <w:rPr>
-                <w:webHidden/>
-              </w:rPr>
-              <w:fldChar w:fldCharType="separate"/>
-            </w:r>
-            <w:r>
-              <w:rPr>
-                <w:webHidden/>
-              </w:rPr>
-              <w:t>3</w:t>
-            </w:r>
-            <w:r>
-              <w:rPr>
-                <w:webHidden/>
-              </w:rPr>
-              <w:fldChar w:fldCharType="end"/>
-            </w:r>
-          </w:hyperlink>
-        </w:p>
-        <w:p>
-          <w:pPr>
-            <w:pStyle w:val="TOC3"/>
-            <w:tabs>
-              <w:tab w:val="right" w:leader="dot" w:pos="10520"/>
-            </w:tabs>
-            <w:rPr>
-              <w:rFonts w:asciiTheme="minorHAnsi" w:eastAsiaTheme="minorEastAsia" w:hAnsiTheme="minorHAnsi" w:cstheme="minorBidi"/>
-              <w:noProof/>
-              <w:kern w:val="2"/>
-              <w14:ligatures w14:val="standardContextual"/>
-            </w:rPr>
-          </w:pPr>
-          <w:hyperlink w:anchor="_Toc226693036" w:history="1">
-            <w:r>
-              <w:rPr>
-                <w:rStyle w:val="Hyperlink"/>
-                <w:noProof/>
-                <w:lang w:bidi="ar-EG"/>
-              </w:rPr>
-              <w:t>Detailed explanation of the solution</w:t>
-            </w:r>
-            <w:r>
-              <w:rPr>
-                <w:noProof/>
-                <w:webHidden/>
-              </w:rPr>
-              <w:tab/>
-            </w:r>
-            <w:r>
-              <w:rPr>
-                <w:noProof/>
-                <w:webHidden/>
-              </w:rPr>
-              <w:fldChar w:fldCharType="begin"/>
-            </w:r>
-            <w:r>
-              <w:rPr>
-                <w:noProof/>
-                <w:webHidden/>
-              </w:rPr>
-              <w:instrText xml:space="preserve"> PAGEREF _Toc226693036 \h </w:instrText>
-            </w:r>
-            <w:r>
-              <w:rPr>
-                <w:noProof/>
-                <w:webHidden/>
-              </w:rPr>
-            </w:r>
-            <w:r>
-              <w:rPr>
-                <w:noProof/>
-                <w:webHidden/>
-              </w:rPr>
-              <w:fldChar w:fldCharType="separate"/>
-            </w:r>
-            <w:r>
-              <w:rPr>
-                <w:noProof/>
-                <w:webHidden/>
-              </w:rPr>
-              <w:t>3</w:t>
-            </w:r>
-            <w:r>
-              <w:rPr>
-                <w:noProof/>
-                <w:webHidden/>
-              </w:rPr>
-              <w:fldChar w:fldCharType="end"/>
-            </w:r>
-          </w:hyperlink>
-        </w:p>
-        <w:p>
-          <w:pPr>
-            <w:pStyle w:val="TOC3"/>
-            <w:tabs>
-              <w:tab w:val="right" w:leader="dot" w:pos="10520"/>
-            </w:tabs>
-            <w:rPr>
-              <w:rFonts w:asciiTheme="minorHAnsi" w:eastAsiaTheme="minorEastAsia" w:hAnsiTheme="minorHAnsi" w:cstheme="minorBidi"/>
-              <w:noProof/>
-              <w:kern w:val="2"/>
-              <w14:ligatures w14:val="standardContextual"/>
-            </w:rPr>
-          </w:pPr>
-          <w:hyperlink w:anchor="_Toc226693037" w:history="1">
-            <w:r>
-              <w:rPr>
-                <w:rStyle w:val="Hyperlink"/>
-                <w:noProof/>
-                <w:lang w:bidi="ar-EG"/>
-              </w:rPr>
-              <w:t>Pseudo Code</w:t>
-            </w:r>
-            <w:r>
-              <w:rPr>
-                <w:noProof/>
-                <w:webHidden/>
-              </w:rPr>
-              <w:tab/>
-            </w:r>
-            <w:r>
-              <w:rPr>
-                <w:noProof/>
-                <w:webHidden/>
-              </w:rPr>
-              <w:fldChar w:fldCharType="begin"/>
-            </w:r>
-            <w:r>
-              <w:rPr>
-                <w:noProof/>
-                <w:webHidden/>
-              </w:rPr>
-              <w:instrText xml:space="preserve"> PAGEREF _Toc226693037 \h </w:instrText>
-            </w:r>
-            <w:r>
-              <w:rPr>
-                <w:noProof/>
-                <w:webHidden/>
-              </w:rPr>
-            </w:r>
-            <w:r>
-              <w:rPr>
-                <w:noProof/>
-                <w:webHidden/>
-              </w:rPr>
-              <w:fldChar w:fldCharType="separate"/>
-            </w:r>
-            <w:r>
-              <w:rPr>
-                <w:noProof/>
-                <w:webHidden/>
-              </w:rPr>
-              <w:t>4</w:t>
-            </w:r>
-            <w:r>
-              <w:rPr>
-                <w:noProof/>
-                <w:webHidden/>
-              </w:rPr>
-              <w:fldChar w:fldCharType="end"/>
-            </w:r>
-          </w:hyperlink>
-        </w:p>
-        <w:p>
-          <w:pPr>
-            <w:pStyle w:val="TOC3"/>
-            <w:tabs>
-              <w:tab w:val="right" w:leader="dot" w:pos="10520"/>
-            </w:tabs>
-            <w:rPr>
-              <w:rFonts w:asciiTheme="minorHAnsi" w:eastAsiaTheme="minorEastAsia" w:hAnsiTheme="minorHAnsi" w:cstheme="minorBidi"/>
-              <w:noProof/>
-              <w:kern w:val="2"/>
-              <w14:ligatures w14:val="standardContextual"/>
-            </w:rPr>
-          </w:pPr>
-          <w:hyperlink w:anchor="_Toc226693038" w:history="1">
-            <w:r>
-              <w:rPr>
-                <w:rStyle w:val="Hyperlink"/>
-                <w:noProof/>
-                <w:lang w:bidi="ar-EG"/>
-              </w:rPr>
-              <w:t>Implementational Code</w:t>
-            </w:r>
-            <w:r>
-              <w:rPr>
-                <w:noProof/>
-                <w:webHidden/>
-              </w:rPr>
-              <w:tab/>
-            </w:r>
-            <w:r>
-              <w:rPr>
-                <w:noProof/>
-                <w:webHidden/>
-              </w:rPr>
-              <w:fldChar w:fldCharType="begin"/>
-            </w:r>
-            <w:r>
-              <w:rPr>
-                <w:noProof/>
-                <w:webHidden/>
-              </w:rPr>
-              <w:instrText xml:space="preserve"> PAGEREF _Toc226693038 \h </w:instrText>
-            </w:r>
-            <w:r>
-              <w:rPr>
-                <w:noProof/>
-                <w:webHidden/>
-              </w:rPr>
-            </w:r>
-            <w:r>
-              <w:rPr>
-                <w:noProof/>
-                <w:webHidden/>
-              </w:rPr>
-              <w:fldChar w:fldCharType="separate"/>
-            </w:r>
-            <w:r>
-              <w:rPr>
-                <w:noProof/>
-                <w:webHidden/>
-              </w:rPr>
-              <w:t>5</w:t>
-            </w:r>
-            <w:r>
-              <w:rPr>
-                <w:noProof/>
-                <w:webHidden/>
-              </w:rPr>
-              <w:fldChar w:fldCharType="end"/>
-            </w:r>
-          </w:hyperlink>
-        </w:p>
-        <w:p>
-          <w:pPr>
-            <w:pStyle w:val="TOC3"/>
-            <w:tabs>
-              <w:tab w:val="right" w:leader="dot" w:pos="10520"/>
-            </w:tabs>
-            <w:rPr>
-              <w:rFonts w:asciiTheme="minorHAnsi" w:eastAsiaTheme="minorEastAsia" w:hAnsiTheme="minorHAnsi" w:cstheme="minorBidi"/>
-              <w:noProof/>
-              <w:kern w:val="2"/>
-              <w14:ligatures w14:val="standardContextual"/>
-            </w:rPr>
-          </w:pPr>
-          <w:hyperlink w:anchor="_Toc226693039" w:history="1">
-            <w:r>
-              <w:rPr>
-                <w:rStyle w:val="Hyperlink"/>
-                <w:noProof/>
-                <w:lang w:bidi="ar-EG"/>
-              </w:rPr>
-              <w:t>Algorithm analysis – time &amp; space complexity</w:t>
-            </w:r>
-            <w:r>
-              <w:rPr>
-                <w:noProof/>
-                <w:webHidden/>
-              </w:rPr>
-              <w:tab/>
-            </w:r>
-            <w:r>
-              <w:rPr>
-                <w:noProof/>
-                <w:webHidden/>
-              </w:rPr>
-              <w:fldChar w:fldCharType="begin"/>
-            </w:r>
-            <w:r>
-              <w:rPr>
-                <w:noProof/>
-                <w:webHidden/>
-              </w:rPr>
-              <w:instrText xml:space="preserve"> PAGEREF _Toc226693039 \h </w:instrText>
-            </w:r>
-            <w:r>
-              <w:rPr>
-                <w:noProof/>
-                <w:webHidden/>
-              </w:rPr>
-            </w:r>
-            <w:r>
-              <w:rPr>
-                <w:noProof/>
-                <w:webHidden/>
-              </w:rPr>
-              <w:fldChar w:fldCharType="separate"/>
-            </w:r>
-            <w:r>
-              <w:rPr>
-                <w:noProof/>
-                <w:webHidden/>
-              </w:rPr>
-              <w:t>7</w:t>
-            </w:r>
-            <w:r>
-              <w:rPr>
-                <w:noProof/>
-                <w:webHidden/>
-              </w:rPr>
-              <w:fldChar w:fldCharType="end"/>
-            </w:r>
-          </w:hyperlink>
-        </w:p>
-        <w:p>
-          <w:pPr>
-            <w:pStyle w:val="TOC2"/>
-            <w:rPr>
-              <w:rFonts w:asciiTheme="minorHAnsi" w:eastAsiaTheme="minorEastAsia" w:hAnsiTheme="minorHAnsi" w:cstheme="minorBidi"/>
-              <w:b w:val="0"/>
-              <w:bCs w:val="0"/>
-              <w:kern w:val="2"/>
-              <w:lang w:bidi="ar-SA"/>
-              <w14:ligatures w14:val="standardContextual"/>
-            </w:rPr>
-          </w:pPr>
-          <w:hyperlink w:anchor="_Toc226693040" w:history="1">
-            <w:r>
-              <w:rPr>
-                <w:rStyle w:val="Hyperlink"/>
-              </w:rPr>
-              <w:t>Sample outputs</w:t>
-            </w:r>
-            <w:r>
-              <w:rPr>
-                <w:webHidden/>
-              </w:rPr>
-              <w:tab/>
-            </w:r>
-            <w:r>
-              <w:rPr>
-                <w:webHidden/>
-              </w:rPr>
-              <w:fldChar w:fldCharType="begin"/>
-            </w:r>
-            <w:r>
-              <w:rPr>
-                <w:webHidden/>
-              </w:rPr>
-              <w:instrText xml:space="preserve"> PAGEREF _Toc226693040 \h </w:instrText>
-            </w:r>
-            <w:r>
-              <w:rPr>
-                <w:webHidden/>
-              </w:rPr>
-            </w:r>
-            <w:r>
-              <w:rPr>
-                <w:webHidden/>
-              </w:rPr>
-              <w:fldChar w:fldCharType="separate"/>
-            </w:r>
-            <w:r>
-              <w:rPr>
-                <w:webHidden/>
-              </w:rPr>
-              <w:t>7</w:t>
-            </w:r>
-            <w:r>
-              <w:rPr>
-                <w:webHidden/>
-              </w:rPr>
-              <w:fldChar w:fldCharType="end"/>
-            </w:r>
-          </w:hyperlink>
-        </w:p>
-        <w:p>
-          <w:pPr>
-            <w:pStyle w:val="TOC2"/>
-            <w:rPr>
-              <w:rFonts w:asciiTheme="minorHAnsi" w:eastAsiaTheme="minorEastAsia" w:hAnsiTheme="minorHAnsi" w:cstheme="minorBidi"/>
-              <w:b w:val="0"/>
-              <w:bCs w:val="0"/>
-              <w:kern w:val="2"/>
-              <w:lang w:bidi="ar-SA"/>
-              <w14:ligatures w14:val="standardContextual"/>
-            </w:rPr>
-          </w:pPr>
-          <w:hyperlink w:anchor="_Toc226693041" w:history="1">
-            <w:r>
-              <w:rPr>
-                <w:rStyle w:val="Hyperlink"/>
-              </w:rPr>
-              <w:t>Answers to Task Questions’</w:t>
-            </w:r>
-            <w:r>
-              <w:rPr>
-                <w:webHidden/>
-              </w:rPr>
-              <w:tab/>
-            </w:r>
-            <w:r>
-              <w:rPr>
-                <w:webHidden/>
-              </w:rPr>
-              <w:fldChar w:fldCharType="begin"/>
-            </w:r>
-            <w:r>
-              <w:rPr>
-                <w:webHidden/>
-              </w:rPr>
-              <w:instrText xml:space="preserve"> PAGEREF _Toc226693041 \h </w:instrText>
-            </w:r>
-            <w:r>
-              <w:rPr>
-                <w:webHidden/>
-              </w:rPr>
-            </w:r>
-            <w:r>
-              <w:rPr>
-                <w:webHidden/>
-              </w:rPr>
-              <w:fldChar w:fldCharType="separate"/>
-            </w:r>
-            <w:r>
-              <w:rPr>
-                <w:webHidden/>
-              </w:rPr>
-              <w:t>9</w:t>
-            </w:r>
-            <w:r>
-              <w:rPr>
-                <w:webHidden/>
-              </w:rPr>
-              <w:fldChar w:fldCharType="end"/>
-            </w:r>
-          </w:hyperlink>
-        </w:p>
-        <w:p>
-          <w:pPr>
-            <w:pStyle w:val="TOC2"/>
-            <w:rPr>
-              <w:rFonts w:asciiTheme="minorHAnsi" w:eastAsiaTheme="minorEastAsia" w:hAnsiTheme="minorHAnsi" w:cstheme="minorBidi"/>
-              <w:b w:val="0"/>
-              <w:bCs w:val="0"/>
-              <w:kern w:val="2"/>
-              <w:lang w:bidi="ar-SA"/>
-              <w14:ligatures w14:val="standardContextual"/>
-            </w:rPr>
-          </w:pPr>
-          <w:hyperlink w:anchor="_Toc226693042" w:history="1">
-            <w:r>
-              <w:rPr>
-                <w:rStyle w:val="Hyperlink"/>
-              </w:rPr>
-              <w:t>Alternative Solutions</w:t>
-            </w:r>
-            <w:r>
-              <w:rPr>
-                <w:webHidden/>
-              </w:rPr>
-              <w:tab/>
-            </w:r>
-            <w:r>
-              <w:rPr>
-                <w:webHidden/>
-              </w:rPr>
-              <w:fldChar w:fldCharType="begin"/>
-            </w:r>
-            <w:r>
-              <w:rPr>
-                <w:webHidden/>
-              </w:rPr>
-              <w:instrText xml:space="preserve"> PAGEREF _Toc226693042 \h </w:instrText>
-            </w:r>
-            <w:r>
-              <w:rPr>
-                <w:webHidden/>
-              </w:rPr>
-            </w:r>
-            <w:r>
-              <w:rPr>
-                <w:webHidden/>
-              </w:rPr>
-              <w:fldChar w:fldCharType="separate"/>
-            </w:r>
-            <w:r>
-              <w:rPr>
-                <w:webHidden/>
-              </w:rPr>
-              <w:t>9</w:t>
-            </w:r>
-            <w:r>
-              <w:rPr>
-                <w:webHidden/>
-              </w:rPr>
-              <w:fldChar w:fldCharType="end"/>
-            </w:r>
-          </w:hyperlink>
-        </w:p>
-        <w:p>
-          <w:pPr>
-            <w:pStyle w:val="TOC2"/>
-            <w:rPr>
-              <w:rFonts w:asciiTheme="minorHAnsi" w:eastAsiaTheme="minorEastAsia" w:hAnsiTheme="minorHAnsi" w:cstheme="minorBidi"/>
-              <w:b w:val="0"/>
-              <w:bCs w:val="0"/>
-              <w:kern w:val="2"/>
-              <w:lang w:bidi="ar-SA"/>
-              <w14:ligatures w14:val="standardContextual"/>
-            </w:rPr>
-          </w:pPr>
-          <w:hyperlink w:anchor="_Toc226693043" w:history="1">
-            <w:r>
-              <w:rPr>
-                <w:rStyle w:val="Hyperlink"/>
-              </w:rPr>
-              <w:t>Key findings and insights</w:t>
-            </w:r>
-            <w:r>
-              <w:rPr>
-                <w:webHidden/>
-              </w:rPr>
-              <w:tab/>
-            </w:r>
-            <w:r>
-              <w:rPr>
-                <w:webHidden/>
-              </w:rPr>
-              <w:fldChar w:fldCharType="begin"/>
-            </w:r>
-            <w:r>
-              <w:rPr>
-                <w:webHidden/>
-              </w:rPr>
-              <w:instrText xml:space="preserve"> PAGEREF _Toc226693043 \h </w:instrText>
-            </w:r>
-            <w:r>
-              <w:rPr>
-                <w:webHidden/>
-              </w:rPr>
-            </w:r>
-            <w:r>
-              <w:rPr>
-                <w:webHidden/>
-              </w:rPr>
-              <w:fldChar w:fldCharType="separate"/>
-            </w:r>
-            <w:r>
-              <w:rPr>
-                <w:webHidden/>
-              </w:rPr>
-              <w:t>9</w:t>
-            </w:r>
-            <w:r>
-              <w:rPr>
-                <w:webHidden/>
-              </w:rPr>
-              <w:fldChar w:fldCharType="end"/>
-            </w:r>
-          </w:hyperlink>
-        </w:p>
-        <w:p>
-          <w:r>
-            <w:rPr>
-              <w:b/>
-              <w:bCs/>
-              <w:noProof/>
-            </w:rPr>
-            <w:fldChar w:fldCharType="end"/>
-          </w:r>
-        </w:p>
-      </w:sdtContent>
-    </w:sdt>
-    <w:p/>
-    <w:p/>
-    <w:p/>
-    <w:p/>
-    <w:p/>
-    <w:p/>
-    <w:p/>
-    <w:p/>
     <w:p>
       <w:pPr>
-        <w:ind w:left="0"/>
-      </w:pPr>
-    </w:p>
-    <w:p>
-      <w:pPr>
-        <w:ind w:left="0"/>
-      </w:pPr>
-    </w:p>
-    <w:p>
-      <w:pPr>
-        <w:ind w:left="0"/>
-      </w:pPr>
-    </w:p>
-    <w:p>
-      <w:pPr>
-        <w:ind w:left="0"/>
-      </w:pPr>
-    </w:p>
-    <w:p>
-      <w:pPr>
-        <w:ind w:left="0"/>
-      </w:pPr>
-    </w:p>
-    <w:p>
-      <w:pPr>
-        <w:ind w:left="0"/>
-      </w:pPr>
-    </w:p>
-    <w:p>
-      <w:pPr>
-        <w:ind w:left="0"/>
-      </w:pPr>
-    </w:p>
-    <w:p>
-      <w:pPr>
-        <w:ind w:left="0"/>
-      </w:pPr>
-    </w:p>
-    <w:p>
-      <w:pPr>
-        <w:ind w:left="0"/>
-      </w:pPr>
-    </w:p>
-    <w:p>
-      <w:pPr>
-        <w:ind w:left="0"/>
-      </w:pPr>
-    </w:p>
-    <w:p>
-      <w:pPr>
-        <w:ind w:left="0"/>
-      </w:pPr>
-    </w:p>
-    <w:p>
-      <w:pPr>
-        <w:ind w:left="0"/>
-      </w:pPr>
-    </w:p>
-    <w:p>
-      <w:pPr>
-        <w:ind w:left="0"/>
-      </w:pPr>
-    </w:p>
-    <w:p>
-      <w:pPr>
         <w:pStyle w:val="Heading1"/>
       </w:pPr>
-      <w:bookmarkStart w:id="2" w:name="_Toc226693030"/>
-      <w:bookmarkEnd w:id="1"/>
-      <w:bookmarkEnd w:id="0"/>
+      <w:bookmarkStart w:id="0" w:name="_Toc226693030"/>
       <w:r>
-        <w:lastRenderedPageBreak/>
         <w:t xml:space="preserve">Task 2 - </w:t>
       </w:r>
       <w:r>
         <w:t>Knight’s Tour Problem</w:t>
       </w:r>
-      <w:bookmarkEnd w:id="2"/>
+      <w:bookmarkEnd w:id="0"/>
     </w:p>
     <w:p>
       <w:pPr>
         <w:pStyle w:val="Heading2"/>
         <w:spacing w:before="0"/>
       </w:pPr>
-      <w:bookmarkStart w:id="3" w:name="_Toc226693031"/>
+      <w:bookmarkStart w:id="1" w:name="_Toc226693031"/>
       <w:r>
         <w:t>Background</w:t>
       </w:r>
-      <w:bookmarkEnd w:id="3"/>
+      <w:bookmarkEnd w:id="1"/>
     </w:p>
     <w:p>
       <w:pPr>
@@ -1141,11 +105,7 @@
         <w:t>closed</w:t>
       </w:r>
       <w:r>
-        <w:t> </w:t>
-      </w:r>
-      <w:proofErr w:type="gramStart"/>
-      <w:r>
-        <w:t>or </w:t>
+        <w:t> or </w:t>
       </w:r>
       <w:r>
         <w:rPr>
@@ -1162,7 +122,6 @@
         <w:noBreakHyphen/>
         <w:t>entrant</w:t>
       </w:r>
-      <w:proofErr w:type="gramEnd"/>
       <w:r>
         <w:t> (otherwise it is </w:t>
       </w:r>
@@ -1197,19 +156,11 @@
         </w:numPr>
       </w:pPr>
       <w:r>
-        <w:t xml:space="preserve">In the context of a closed </w:t>
-      </w:r>
-      <w:proofErr w:type="gramStart"/>
-      <w:r>
-        <w:t>(re</w:t>
+        <w:t>In the context of a closed (re</w:t>
       </w:r>
       <w:r>
         <w:noBreakHyphen/>
-        <w:t>entrant</w:t>
-      </w:r>
-      <w:proofErr w:type="gramEnd"/>
-      <w:r>
-        <w:t xml:space="preserve">) knight’s tour, the tour must end on a square that is </w:t>
+        <w:t xml:space="preserve">entrant) knight’s tour, the tour must end on a square that is </w:t>
       </w:r>
       <w:r>
         <w:rPr>
@@ -1357,21 +308,21 @@
         <w:pStyle w:val="Heading2"/>
         <w:spacing w:before="0"/>
       </w:pPr>
-      <w:bookmarkStart w:id="4" w:name="_Toc217532938"/>
-      <w:bookmarkStart w:id="5" w:name="_Toc217598122"/>
-      <w:bookmarkStart w:id="6" w:name="_Toc226693032"/>
+      <w:bookmarkStart w:id="2" w:name="_Toc217532938"/>
+      <w:bookmarkStart w:id="3" w:name="_Toc217598122"/>
+      <w:bookmarkStart w:id="4" w:name="_Toc226693032"/>
       <w:r>
         <w:t>Task</w:t>
       </w:r>
       <w:r>
         <w:t xml:space="preserve"> </w:t>
       </w:r>
-      <w:bookmarkEnd w:id="4"/>
-      <w:bookmarkEnd w:id="5"/>
+      <w:bookmarkEnd w:id="2"/>
+      <w:bookmarkEnd w:id="3"/>
       <w:r>
         <w:t>Statement</w:t>
       </w:r>
-      <w:bookmarkEnd w:id="6"/>
+      <w:bookmarkEnd w:id="4"/>
     </w:p>
     <w:p>
       <w:pPr>
@@ -1630,9 +581,9 @@
         <w:pStyle w:val="Heading2"/>
         <w:spacing w:before="0"/>
       </w:pPr>
-      <w:bookmarkStart w:id="7" w:name="_Toc217532940"/>
-      <w:bookmarkStart w:id="8" w:name="_Toc217598124"/>
-      <w:bookmarkStart w:id="9" w:name="_Toc226693033"/>
+      <w:bookmarkStart w:id="5" w:name="_Toc217532940"/>
+      <w:bookmarkStart w:id="6" w:name="_Toc217598124"/>
+      <w:bookmarkStart w:id="7" w:name="_Toc226693033"/>
       <w:r>
         <w:t>Implement</w:t>
       </w:r>
@@ -1642,9 +593,9 @@
       <w:r>
         <w:t xml:space="preserve"> Key Features</w:t>
       </w:r>
+      <w:bookmarkEnd w:id="5"/>
+      <w:bookmarkEnd w:id="6"/>
       <w:bookmarkEnd w:id="7"/>
-      <w:bookmarkEnd w:id="8"/>
-      <w:bookmarkEnd w:id="9"/>
     </w:p>
     <w:p>
       <w:pPr>
@@ -1720,19 +671,11 @@
         </w:rPr>
         <w:t xml:space="preserve">Run greedy algorithm to find is </w:t>
       </w:r>
-      <w:proofErr w:type="gramStart"/>
       <w:r>
         <w:rPr>
           <w:lang w:bidi="ar-EG"/>
         </w:rPr>
-        <w:t>there</w:t>
-      </w:r>
-      <w:proofErr w:type="gramEnd"/>
-      <w:r>
-        <w:rPr>
-          <w:lang w:bidi="ar-EG"/>
-        </w:rPr>
-        <w:t xml:space="preserve"> </w:t>
+        <w:t xml:space="preserve">there </w:t>
       </w:r>
       <w:r>
         <w:rPr>
@@ -1823,12 +766,11 @@
         <w:pStyle w:val="Heading2"/>
         <w:spacing w:before="0"/>
       </w:pPr>
-      <w:bookmarkStart w:id="10" w:name="_Toc226693034"/>
+      <w:bookmarkStart w:id="8" w:name="_Toc226693034"/>
       <w:r>
-        <w:lastRenderedPageBreak/>
         <w:t>Comprehensive Description</w:t>
       </w:r>
-      <w:bookmarkEnd w:id="10"/>
+      <w:bookmarkEnd w:id="8"/>
       <w:r>
         <w:t xml:space="preserve"> </w:t>
       </w:r>
@@ -1908,34 +850,16 @@
           <w:bCs/>
           <w:lang w:bidi="ar-EG"/>
         </w:rPr>
-        <w:t xml:space="preserve">Closed tour </w:t>
+        <w:t>Closed tour (re</w:t>
       </w:r>
-      <w:proofErr w:type="gramStart"/>
       <w:r>
         <w:rPr>
           <w:b/>
           <w:bCs/>
           <w:lang w:bidi="ar-EG"/>
         </w:rPr>
-        <w:t>(re</w:t>
-      </w:r>
-      <w:r>
-        <w:rPr>
-          <w:b/>
-          <w:bCs/>
-          <w:lang w:bidi="ar-EG"/>
-        </w:rPr>
         <w:noBreakHyphen/>
-        <w:t>entrant</w:t>
-      </w:r>
-      <w:proofErr w:type="gramEnd"/>
-      <w:r>
-        <w:rPr>
-          <w:b/>
-          <w:bCs/>
-          <w:lang w:bidi="ar-EG"/>
-        </w:rPr>
-        <w:t>)</w:t>
+        <w:t>entrant)</w:t>
       </w:r>
       <w:r>
         <w:rPr>
@@ -2026,21 +950,7 @@
         <w:rPr>
           <w:lang w:bidi="ar-EG"/>
         </w:rPr>
-        <w:t xml:space="preserve">A legal knight </w:t>
-      </w:r>
-      <w:proofErr w:type="gramStart"/>
-      <w:r>
-        <w:rPr>
-          <w:lang w:bidi="ar-EG"/>
-        </w:rPr>
-        <w:t>move</w:t>
-      </w:r>
-      <w:proofErr w:type="gramEnd"/>
-      <w:r>
-        <w:rPr>
-          <w:lang w:bidi="ar-EG"/>
-        </w:rPr>
-        <w:t xml:space="preserve"> between two squares is an </w:t>
+        <w:t>A legal knight move between two squares is an </w:t>
       </w:r>
       <w:r>
         <w:rPr>
@@ -2108,21 +1018,7 @@
         <w:rPr>
           <w:lang w:bidi="ar-EG"/>
         </w:rPr>
-        <w:t xml:space="preserve">A </w:t>
-      </w:r>
-      <w:proofErr w:type="gramStart"/>
-      <w:r>
-        <w:rPr>
-          <w:lang w:bidi="ar-EG"/>
-        </w:rPr>
-        <w:t>closed</w:t>
-      </w:r>
-      <w:proofErr w:type="gramEnd"/>
-      <w:r>
-        <w:rPr>
-          <w:lang w:bidi="ar-EG"/>
-        </w:rPr>
-        <w:t xml:space="preserve"> knight’s tour corresponds to a </w:t>
+        <w:t>A closed knight’s tour corresponds to a </w:t>
       </w:r>
       <w:r>
         <w:rPr>
@@ -2150,11 +1046,11 @@
       <w:pPr>
         <w:pStyle w:val="Heading2"/>
       </w:pPr>
-      <w:bookmarkStart w:id="11" w:name="_Toc226693035"/>
+      <w:bookmarkStart w:id="9" w:name="_Toc226693035"/>
       <w:r>
         <w:t>Problem Solution</w:t>
       </w:r>
-      <w:bookmarkEnd w:id="11"/>
+      <w:bookmarkEnd w:id="9"/>
       <w:r>
         <w:t xml:space="preserve"> </w:t>
       </w:r>
@@ -2163,11 +1059,11 @@
       <w:pPr>
         <w:pStyle w:val="Heading3"/>
       </w:pPr>
-      <w:bookmarkStart w:id="12" w:name="_Toc226693036"/>
+      <w:bookmarkStart w:id="10" w:name="_Toc226693036"/>
       <w:r>
         <w:t>Detailed explanation of the solution</w:t>
       </w:r>
-      <w:bookmarkEnd w:id="12"/>
+      <w:bookmarkEnd w:id="10"/>
       <w:r>
         <w:t xml:space="preserve"> </w:t>
       </w:r>
@@ -2275,21 +1171,7 @@
         <w:rPr>
           <w:lang w:bidi="ar-EG"/>
         </w:rPr>
-        <w:t xml:space="preserve"> Squares with few onward moves are most “constrained” and should be visited early to avoid becoming dead ends later. This </w:t>
-      </w:r>
-      <w:proofErr w:type="gramStart"/>
-      <w:r>
-        <w:rPr>
-          <w:lang w:bidi="ar-EG"/>
-        </w:rPr>
-        <w:t>local greedy</w:t>
-      </w:r>
-      <w:proofErr w:type="gramEnd"/>
-      <w:r>
-        <w:rPr>
-          <w:lang w:bidi="ar-EG"/>
-        </w:rPr>
-        <w:t xml:space="preserve"> choice almost always leads to a complete tour.</w:t>
+        <w:t> Squares with few onward moves are most “constrained” and should be visited early to avoid becoming dead ends later. This local greedy choice almost always leads to a complete tour.</w:t>
       </w:r>
     </w:p>
     <w:p>
@@ -2303,28 +1185,14 @@
         <w:rPr>
           <w:lang w:bidi="ar-EG"/>
         </w:rPr>
-        <w:t xml:space="preserve">A closed </w:t>
-      </w:r>
-      <w:proofErr w:type="gramStart"/>
-      <w:r>
-        <w:rPr>
-          <w:lang w:bidi="ar-EG"/>
-        </w:rPr>
-        <w:t>(re</w:t>
+        <w:t>A closed (re</w:t>
       </w:r>
       <w:r>
         <w:rPr>
           <w:lang w:bidi="ar-EG"/>
         </w:rPr>
         <w:noBreakHyphen/>
-        <w:t>entrant</w:t>
-      </w:r>
-      <w:proofErr w:type="gramEnd"/>
-      <w:r>
-        <w:rPr>
-          <w:lang w:bidi="ar-EG"/>
-        </w:rPr>
-        <w:t xml:space="preserve">) tour requires the first and last squares to be a knight’s move apart. </w:t>
+        <w:t xml:space="preserve">entrant) tour requires the first and last squares to be a knight’s move apart. </w:t>
       </w:r>
     </w:p>
     <w:p>
@@ -2390,21 +1258,7 @@
         <w:rPr>
           <w:lang w:bidi="ar-EG"/>
         </w:rPr>
-        <w:t xml:space="preserve">The degree of a square is defined as the number of legal </w:t>
-      </w:r>
-      <w:proofErr w:type="gramStart"/>
-      <w:r>
-        <w:rPr>
-          <w:lang w:bidi="ar-EG"/>
-        </w:rPr>
-        <w:t>knight</w:t>
-      </w:r>
-      <w:proofErr w:type="gramEnd"/>
-      <w:r>
-        <w:rPr>
-          <w:lang w:bidi="ar-EG"/>
-        </w:rPr>
-        <w:t xml:space="preserve"> moves from that square on an empty board , the number of squares a knight can reach in one move, ignoring whether those squares have been visited. For example, on an 8×8 board, a corner has degree 2 (even), a square one step from a corner has degree 3 (odd), and a central square has degree 8 (even).</w:t>
+        <w:t>The degree of a square is defined as the number of legal knight moves from that square on an empty board , the number of squares a knight can reach in one move, ignoring whether those squares have been visited. For example, on an 8×8 board, a corner has degree 2 (even), a square one step from a corner has degree 3 (odd), and a central square has degree 8 (even).</w:t>
       </w:r>
     </w:p>
     <w:p>
@@ -2442,12 +1296,12 @@
       <w:pPr>
         <w:pStyle w:val="Heading3"/>
       </w:pPr>
-      <w:bookmarkStart w:id="13" w:name="_Toc226693037"/>
+      <w:bookmarkStart w:id="11" w:name="_Toc226693037"/>
       <w:r>
         <w:lastRenderedPageBreak/>
         <w:t>Pseudo Code</w:t>
       </w:r>
-      <w:bookmarkEnd w:id="13"/>
+      <w:bookmarkEnd w:id="11"/>
       <w:r>
         <w:t xml:space="preserve"> </w:t>
       </w:r>
@@ -2789,17 +1643,7 @@
                                 <w:sz w:val="20"/>
                                 <w:szCs w:val="20"/>
                               </w:rPr>
-                              <w:t>//</w:t>
-                            </w:r>
-                            <w:r>
-                              <w:rPr>
-                                <w:rFonts w:ascii="Times New Roman" w:hAnsi="Times New Roman" w:cs="Times New Roman"/>
-                                <w:i/>
-                                <w:iCs/>
-                                <w:sz w:val="20"/>
-                                <w:szCs w:val="20"/>
-                              </w:rPr>
-                              <w:t>lists all 8 possible L-shaped knight jumps</w:t>
+                              <w:t>//lists all 8 possible L-shaped knight jumps</w:t>
                             </w:r>
                           </w:p>
                           <w:p>
@@ -2822,15 +1666,7 @@
                                 <w:sz w:val="22"/>
                                 <w:szCs w:val="22"/>
                               </w:rPr>
-                              <w:t xml:space="preserve"> ← [(2,1),(1,2),(−1,2),(−2,1),(−2,−1),(−1,−2),(1,−2),(2,−1)]</w:t>
-                            </w:r>
-                            <w:r>
-                              <w:rPr>
-                                <w:rFonts w:ascii="Times New Roman" w:hAnsi="Times New Roman" w:cs="Times New Roman"/>
-                                <w:sz w:val="22"/>
-                                <w:szCs w:val="22"/>
-                              </w:rPr>
-                              <w:t xml:space="preserve"> </w:t>
+                              <w:t xml:space="preserve"> ← [(2,1),(1,2),(−1,2),(−2,1),(−2,−1),(−1,−2),(1,−2),(2,−1)] </w:t>
                             </w:r>
                             <w:r>
                               <w:rPr>
@@ -2860,17 +1696,7 @@
                                 <w:sz w:val="20"/>
                                 <w:szCs w:val="20"/>
                               </w:rPr>
-                              <w:t xml:space="preserve">// </w:t>
-                            </w:r>
-                            <w:r>
-                              <w:rPr>
-                                <w:rFonts w:ascii="Times New Roman" w:hAnsi="Times New Roman" w:cs="Times New Roman"/>
-                                <w:i/>
-                                <w:iCs/>
-                                <w:sz w:val="20"/>
-                                <w:szCs w:val="20"/>
-                              </w:rPr>
-                              <w:t>Before moving to any square, this checks three things: is (x, y) still inside the board, and has it not been visited yet</w:t>
+                              <w:t>// Before moving to any square, this checks three things: is (x, y) still inside the board, and has it not been visited yet</w:t>
                             </w:r>
                           </w:p>
                           <w:p>
@@ -3156,37 +1982,7 @@
                                 <w:sz w:val="20"/>
                                 <w:szCs w:val="20"/>
                               </w:rPr>
-                              <w:t xml:space="preserve">// </w:t>
-                            </w:r>
-                            <w:r>
-                              <w:rPr>
-                                <w:rFonts w:ascii="Times New Roman" w:hAnsi="Times New Roman" w:cs="Times New Roman"/>
-                                <w:i/>
-                                <w:iCs/>
-                                <w:sz w:val="20"/>
-                                <w:szCs w:val="20"/>
-                              </w:rPr>
-                              <w:t xml:space="preserve">counts how many moves the knight could make from </w:t>
-                            </w:r>
-                            <w:r>
-                              <w:rPr>
-                                <w:rFonts w:ascii="Times New Roman" w:hAnsi="Times New Roman" w:cs="Times New Roman"/>
-                                <w:i/>
-                                <w:iCs/>
-                                <w:sz w:val="20"/>
-                                <w:szCs w:val="20"/>
-                              </w:rPr>
-                              <w:t>candidate square</w:t>
-                            </w:r>
-                            <w:r>
-                              <w:rPr>
-                                <w:rFonts w:ascii="Times New Roman" w:hAnsi="Times New Roman" w:cs="Times New Roman"/>
-                                <w:i/>
-                                <w:iCs/>
-                                <w:sz w:val="20"/>
-                                <w:szCs w:val="20"/>
-                              </w:rPr>
-                              <w:t xml:space="preserve"> to other unvisited squares</w:t>
+                              <w:t>// counts how many moves the knight could make from candidate square to other unvisited squares</w:t>
                             </w:r>
                           </w:p>
                           <w:p>
@@ -3701,7 +2497,6 @@
                               </w:rPr>
                               <w:t xml:space="preserve"> ← 1 </w:t>
                             </w:r>
-                            <w:proofErr w:type="spellStart"/>
                             <w:r>
                               <w:rPr>
                                 <w:rFonts w:ascii="Times New Roman" w:hAnsi="Times New Roman" w:cs="Times New Roman"/>
@@ -3722,7 +2517,6 @@
                               </w:rPr>
                               <w:t>n</w:t>
                             </w:r>
-                            <w:proofErr w:type="spellEnd"/>
                             <w:r>
                               <w:rPr>
                                 <w:rFonts w:ascii="Times New Roman" w:hAnsi="Times New Roman" w:cs="Times New Roman"/>
@@ -4636,7 +3430,7 @@
               </wp:anchor>
             </w:drawing>
           </mc:Choice>
-          <mc:Fallback>
+          <mc:Fallback xmlns:w16sdtfl="http://schemas.microsoft.com/office/word/2024/wordml/sdtformatlock">
             <w:pict>
               <v:shapetype w14:anchorId="25060C4D" id="_x0000_t202" coordsize="21600,21600" o:spt="202" path="m,l,21600r21600,l21600,xe">
                 <v:stroke joinstyle="miter"/>
@@ -7089,12 +5883,12 @@
       <w:pPr>
         <w:pStyle w:val="Heading3"/>
       </w:pPr>
-      <w:bookmarkStart w:id="14" w:name="_Toc226693038"/>
+      <w:bookmarkStart w:id="12" w:name="_Toc226693038"/>
       <w:r>
         <w:lastRenderedPageBreak/>
         <w:t>Implementational Code</w:t>
       </w:r>
-      <w:bookmarkEnd w:id="14"/>
+      <w:bookmarkEnd w:id="12"/>
       <w:r>
         <w:t xml:space="preserve"> </w:t>
       </w:r>
@@ -7115,6 +5909,7 @@
       </w:pPr>
       <w:r>
         <w:rPr>
+          <w:noProof/>
           <w:lang w:bidi="ar-EG"/>
         </w:rPr>
         <w:drawing>
@@ -7286,6 +6081,7 @@
       </w:pPr>
       <w:r>
         <w:rPr>
+          <w:noProof/>
           <w:lang w:bidi="ar-EG"/>
         </w:rPr>
         <w:drawing>
@@ -7492,6 +6288,7 @@
       </w:pPr>
       <w:r>
         <w:rPr>
+          <w:noProof/>
           <w:lang w:bidi="ar-EG"/>
         </w:rPr>
         <w:drawing>
@@ -7751,6 +6548,7 @@
       </w:pPr>
       <w:r>
         <w:rPr>
+          <w:noProof/>
           <w:lang w:bidi="ar-EG"/>
         </w:rPr>
         <w:drawing>
@@ -7956,19 +6754,7 @@
         <w:rPr>
           <w:lang w:bidi="ar-EG"/>
         </w:rPr>
-        <w:t xml:space="preserve">The </w:t>
-      </w:r>
-      <w:r>
-        <w:rPr>
-          <w:lang w:bidi="ar-EG"/>
-        </w:rPr>
-        <w:t>initialization</w:t>
-      </w:r>
-      <w:r>
-        <w:rPr>
-          <w:lang w:bidi="ar-EG"/>
-        </w:rPr>
-        <w:t xml:space="preserve"> phase begins with a double loop that resets every cell of the board to -1, indicating an unvisited state. The knight is then placed at the user</w:t>
+        <w:t>The initialization phase begins with a double loop that resets every cell of the board to -1, indicating an unvisited state. The knight is then placed at the user</w:t>
       </w:r>
       <w:r>
         <w:rPr>
@@ -8030,33 +6816,7 @@
         <w:rPr>
           <w:lang w:bidi="ar-EG"/>
         </w:rPr>
-        <w:t xml:space="preserve"> is </w:t>
-      </w:r>
-      <w:r>
-        <w:rPr>
-          <w:lang w:bidi="ar-EG"/>
-        </w:rPr>
-        <w:t>initialized</w:t>
-      </w:r>
-      <w:r>
-        <w:rPr>
-          <w:lang w:bidi="ar-EG"/>
-        </w:rPr>
-        <w:t xml:space="preserve"> to 9 because the maximum possible number of onward moves from any square is 8; </w:t>
-      </w:r>
-      <w:proofErr w:type="gramStart"/>
-      <w:r>
-        <w:rPr>
-          <w:lang w:bidi="ar-EG"/>
-        </w:rPr>
-        <w:t>thus</w:t>
-      </w:r>
-      <w:proofErr w:type="gramEnd"/>
-      <w:r>
-        <w:rPr>
-          <w:lang w:bidi="ar-EG"/>
-        </w:rPr>
-        <w:t xml:space="preserve"> any valid candidate will immediately yield a smaller value. </w:t>
+        <w:t xml:space="preserve"> is initialized to 9 because the maximum possible number of onward moves from any square is 8; thus any valid candidate will immediately yield a smaller value. </w:t>
       </w:r>
       <w:r>
         <w:rPr>
@@ -8152,19 +6912,7 @@
         <w:rPr>
           <w:lang w:bidi="ar-EG"/>
         </w:rPr>
-        <w:t xml:space="preserve">Within each iteration, the algorithm examines all eight possible knight jumps from the current position. For each </w:t>
-      </w:r>
-      <w:r>
-        <w:rPr>
-          <w:lang w:bidi="ar-EG"/>
-        </w:rPr>
-        <w:t>neighbor</w:t>
-      </w:r>
-      <w:r>
-        <w:rPr>
-          <w:lang w:bidi="ar-EG"/>
-        </w:rPr>
-        <w:t xml:space="preserve"> that lies inside the board and remains unvisited, the function </w:t>
+        <w:t>Within each iteration, the algorithm examines all eight possible knight jumps from the current position. For each neighbor that lies inside the board and remains unvisited, the function </w:t>
       </w:r>
       <w:r>
         <w:rPr>
@@ -8180,19 +6928,7 @@
         <w:rPr>
           <w:lang w:bidi="ar-EG"/>
         </w:rPr>
-        <w:t xml:space="preserve"> computes its degree (the number of unvisited squares reachable from that </w:t>
-      </w:r>
-      <w:r>
-        <w:rPr>
-          <w:lang w:bidi="ar-EG"/>
-        </w:rPr>
-        <w:t>neighbor</w:t>
-      </w:r>
-      <w:r>
-        <w:rPr>
-          <w:lang w:bidi="ar-EG"/>
-        </w:rPr>
-        <w:t>).</w:t>
+        <w:t> computes its degree (the number of unvisited squares reachable from that neighbor).</w:t>
       </w:r>
       <w:r>
         <w:rPr>
@@ -8350,7 +7086,7 @@
       <w:pPr>
         <w:pStyle w:val="Heading3"/>
       </w:pPr>
-      <w:bookmarkStart w:id="15" w:name="_Toc226693039"/>
+      <w:bookmarkStart w:id="13" w:name="_Toc226693039"/>
       <w:r>
         <w:lastRenderedPageBreak/>
         <w:t>Algorithm analysis</w:t>
@@ -8358,7 +7094,7 @@
       <w:r>
         <w:t xml:space="preserve"> – time &amp; space complexity</w:t>
       </w:r>
-      <w:bookmarkEnd w:id="15"/>
+      <w:bookmarkEnd w:id="13"/>
       <w:r>
         <w:t xml:space="preserve"> </w:t>
       </w:r>
@@ -8561,11 +7297,11 @@
       <w:pPr>
         <w:pStyle w:val="Heading2"/>
       </w:pPr>
-      <w:bookmarkStart w:id="16" w:name="_Toc226693040"/>
+      <w:bookmarkStart w:id="14" w:name="_Toc226693040"/>
       <w:r>
         <w:t>Sample outputs</w:t>
       </w:r>
-      <w:bookmarkEnd w:id="16"/>
+      <w:bookmarkEnd w:id="14"/>
     </w:p>
     <w:tbl>
       <w:tblPr>
@@ -8691,6 +7427,7 @@
             </w:pPr>
             <w:r>
               <w:rPr>
+                <w:noProof/>
                 <w:lang w:bidi="ar-EG"/>
               </w:rPr>
               <w:drawing>
@@ -8774,6 +7511,7 @@
             </w:pPr>
             <w:r>
               <w:rPr>
+                <w:noProof/>
                 <w:lang w:bidi="ar-EG"/>
               </w:rPr>
               <w:drawing>
@@ -8855,6 +7593,7 @@
             </w:pPr>
             <w:r>
               <w:rPr>
+                <w:noProof/>
                 <w:lang w:bidi="ar-EG"/>
               </w:rPr>
               <w:drawing>
@@ -8910,6 +7649,7 @@
             </w:pPr>
             <w:r>
               <w:rPr>
+                <w:noProof/>
                 <w:lang w:bidi="ar-EG"/>
               </w:rPr>
               <w:drawing>
@@ -8991,6 +7731,7 @@
             </w:pPr>
             <w:r>
               <w:rPr>
+                <w:noProof/>
                 <w:lang w:bidi="ar-EG"/>
               </w:rPr>
               <w:drawing>
@@ -9046,6 +7787,7 @@
             </w:pPr>
             <w:r>
               <w:rPr>
+                <w:noProof/>
                 <w:lang w:bidi="ar-EG"/>
               </w:rPr>
               <w:drawing>
@@ -9128,6 +7870,7 @@
             </w:pPr>
             <w:r>
               <w:rPr>
+                <w:noProof/>
                 <w:lang w:bidi="ar-EG"/>
               </w:rPr>
               <w:drawing>
@@ -9183,6 +7926,7 @@
             </w:pPr>
             <w:r>
               <w:rPr>
+                <w:noProof/>
                 <w:lang w:bidi="ar-EG"/>
               </w:rPr>
               <w:drawing>
@@ -9264,6 +8008,7 @@
             </w:pPr>
             <w:r>
               <w:rPr>
+                <w:noProof/>
                 <w:lang w:bidi="ar-EG"/>
               </w:rPr>
               <w:drawing>
@@ -9319,6 +8064,7 @@
             </w:pPr>
             <w:r>
               <w:rPr>
+                <w:noProof/>
                 <w:lang w:bidi="ar-EG"/>
               </w:rPr>
               <w:drawing>
@@ -9400,6 +8146,7 @@
             </w:pPr>
             <w:r>
               <w:rPr>
+                <w:noProof/>
                 <w:lang w:bidi="ar-EG"/>
               </w:rPr>
               <w:drawing>
@@ -9455,6 +8202,7 @@
             </w:pPr>
             <w:r>
               <w:rPr>
+                <w:noProof/>
                 <w:lang w:bidi="ar-EG"/>
               </w:rPr>
               <w:drawing>
@@ -9538,12 +8286,12 @@
       <w:pPr>
         <w:pStyle w:val="Heading2"/>
       </w:pPr>
-      <w:bookmarkStart w:id="17" w:name="_Toc226693041"/>
+      <w:bookmarkStart w:id="15" w:name="_Toc226693041"/>
       <w:r>
         <w:lastRenderedPageBreak/>
         <w:t>Answers to Task Questions’</w:t>
       </w:r>
-      <w:bookmarkEnd w:id="17"/>
+      <w:bookmarkEnd w:id="15"/>
     </w:p>
     <w:p>
       <w:r>
@@ -9562,14 +8310,7 @@
           <w:b/>
           <w:bCs/>
         </w:rPr>
-        <w:t xml:space="preserve"> </w:t>
-      </w:r>
-      <w:r>
-        <w:rPr>
-          <w:b/>
-          <w:bCs/>
-        </w:rPr>
-        <w:t xml:space="preserve">Closed tours exist for all even n ≥ </w:t>
+        <w:t xml:space="preserve"> Closed tours exist for all even n ≥ </w:t>
       </w:r>
       <w:r>
         <w:rPr>
@@ -9586,15 +8327,7 @@
         <w:t>.</w:t>
       </w:r>
       <w:r>
-        <w:t xml:space="preserve"> They are provably impossible for all odd n (parity argument) and for n ≤ 4 (small-board arguments). </w:t>
-      </w:r>
-      <w:proofErr w:type="gramStart"/>
-      <w:r>
-        <w:t>So</w:t>
-      </w:r>
-      <w:proofErr w:type="gramEnd"/>
-      <w:r>
-        <w:t xml:space="preserve"> every n &gt; 8 that is even supports a closed tour, while every odd n &gt; 8 supports only an open tour.</w:t>
+        <w:t xml:space="preserve"> They are provably impossible for all odd n (parity argument) and for n ≤ 4 (small-board arguments). So every n &gt; 8 that is even supports a closed tour, while every odd n &gt; 8 supports only an open tour.</w:t>
       </w:r>
     </w:p>
     <w:p>
@@ -10919,14 +9652,14 @@
       <w:pPr>
         <w:pStyle w:val="Heading2"/>
       </w:pPr>
-      <w:bookmarkStart w:id="18" w:name="_Toc226693042"/>
+      <w:bookmarkStart w:id="16" w:name="_Toc226693042"/>
       <w:r>
         <w:t>Alternative</w:t>
       </w:r>
       <w:r>
         <w:t xml:space="preserve"> Solutions</w:t>
       </w:r>
-      <w:bookmarkEnd w:id="18"/>
+      <w:bookmarkEnd w:id="16"/>
     </w:p>
     <w:p>
       <w:pPr>
@@ -11080,11 +9813,11 @@
       <w:pPr>
         <w:pStyle w:val="Heading2"/>
       </w:pPr>
-      <w:bookmarkStart w:id="19" w:name="_Toc226693043"/>
+      <w:bookmarkStart w:id="17" w:name="_Toc226693043"/>
       <w:r>
         <w:t>Key findings and insights</w:t>
       </w:r>
-      <w:bookmarkEnd w:id="19"/>
+      <w:bookmarkEnd w:id="17"/>
       <w:r>
         <w:t xml:space="preserve"> </w:t>
       </w:r>
@@ -11154,12 +9887,6 @@
     <w:sectPr>
       <w:pgSz w:w="12240" w:h="15840"/>
       <w:pgMar w:top="720" w:right="900" w:bottom="810" w:left="810" w:header="720" w:footer="720" w:gutter="0"/>
-      <w:pgBorders w:display="notFirstPage" w:offsetFrom="page">
-        <w:top w:val="thinThickSmallGap" w:sz="24" w:space="24" w:color="auto"/>
-        <w:left w:val="thinThickSmallGap" w:sz="24" w:space="24" w:color="auto"/>
-        <w:bottom w:val="thickThinSmallGap" w:sz="24" w:space="24" w:color="auto"/>
-        <w:right w:val="thickThinSmallGap" w:sz="24" w:space="24" w:color="auto"/>
-      </w:pgBorders>
       <w:cols w:space="720"/>
       <w:docGrid w:linePitch="360"/>
     </w:sectPr>
@@ -11168,7 +9895,7 @@
 </file>
 
 <file path=word/endnotes.xml><?xml version="1.0" encoding="utf-8"?>
-<w:endnotes xmlns:wpc="http://schemas.microsoft.com/office/word/2010/wordprocessingCanvas" xmlns:cx="http://schemas.microsoft.com/office/drawing/2014/chartex" xmlns:cx1="http://schemas.microsoft.com/office/drawing/2015/9/8/chartex" xmlns:cx2="http://schemas.microsoft.com/office/drawing/2015/10/21/chartex" xmlns:cx3="http://schemas.microsoft.com/office/drawing/2016/5/9/chartex" xmlns:cx4="http://schemas.microsoft.com/office/drawing/2016/5/10/chartex" xmlns:cx5="http://schemas.microsoft.com/office/drawing/2016/5/11/chartex" xmlns:cx6="http://schemas.microsoft.com/office/drawing/2016/5/12/chartex" xmlns:cx7="http://schemas.microsoft.com/office/drawing/2016/5/13/chartex" xmlns:cx8="http://schemas.microsoft.com/office/drawing/2016/5/14/chartex" xmlns:mc="http://schemas.openxmlformats.org/markup-compatibility/2006" xmlns:aink="http://schemas.microsoft.com/office/drawing/2016/ink" xmlns:am3d="http://schemas.microsoft.com/office/drawing/2017/model3d" xmlns:o="urn:schemas-microsoft-com:office:office" xmlns:oel="http://schemas.microsoft.com/office/2019/extlst" xmlns:r="http://schemas.openxmlformats.org/officeDocument/2006/relationships" xmlns:m="http://schemas.openxmlformats.org/officeDocument/2006/math" xmlns:v="urn:schemas-microsoft-com:vml" xmlns:wp14="http://schemas.microsoft.com/office/word/2010/wordprocessingDrawing" xmlns:wp="http://schemas.openxmlformats.org/drawingml/2006/wordprocessingDrawing" xmlns:w10="urn:schemas-microsoft-com:office:word" xmlns:w="http://schemas.openxmlformats.org/wordprocessingml/2006/main" xmlns:w14="http://schemas.microsoft.com/office/word/2010/wordml" xmlns:w15="http://schemas.microsoft.com/office/word/2012/wordml" xmlns:w16cex="http://schemas.microsoft.com/office/word/2018/wordml/cex" xmlns:w16cid="http://schemas.microsoft.com/office/word/2016/wordml/cid" xmlns:w16="http://schemas.microsoft.com/office/word/2018/wordml" xmlns:w16du="http://schemas.microsoft.com/office/word/2023/wordml/word16du" xmlns:w16sdtdh="http://schemas.microsoft.com/office/word/2020/wordml/sdtdatahash" xmlns:w16sdtfl="http://schemas.microsoft.com/office/word/2024/wordml/sdtformatlock" xmlns:w16se="http://schemas.microsoft.com/office/word/2015/wordml/symex" xmlns:wpg="http://schemas.microsoft.com/office/word/2010/wordprocessingGroup" xmlns:wpi="http://schemas.microsoft.com/office/word/2010/wordprocessingInk" xmlns:wne="http://schemas.microsoft.com/office/word/2006/wordml" xmlns:wps="http://schemas.microsoft.com/office/word/2010/wordprocessingShape" mc:Ignorable="w14 w15 w16se w16cid w16 w16cex w16sdtdh w16sdtfl w16du wp14">
+<w:endnotes xmlns:wpc="http://schemas.microsoft.com/office/word/2010/wordprocessingCanvas" xmlns:cx="http://schemas.microsoft.com/office/drawing/2014/chartex" xmlns:cx1="http://schemas.microsoft.com/office/drawing/2015/9/8/chartex" xmlns:cx2="http://schemas.microsoft.com/office/drawing/2015/10/21/chartex" xmlns:cx3="http://schemas.microsoft.com/office/drawing/2016/5/9/chartex" xmlns:cx4="http://schemas.microsoft.com/office/drawing/2016/5/10/chartex" xmlns:cx5="http://schemas.microsoft.com/office/drawing/2016/5/11/chartex" xmlns:cx6="http://schemas.microsoft.com/office/drawing/2016/5/12/chartex" xmlns:cx7="http://schemas.microsoft.com/office/drawing/2016/5/13/chartex" xmlns:cx8="http://schemas.microsoft.com/office/drawing/2016/5/14/chartex" xmlns:mc="http://schemas.openxmlformats.org/markup-compatibility/2006" xmlns:aink="http://schemas.microsoft.com/office/drawing/2016/ink" xmlns:am3d="http://schemas.microsoft.com/office/drawing/2017/model3d" xmlns:o="urn:schemas-microsoft-com:office:office" xmlns:oel="http://schemas.microsoft.com/office/2019/extlst" xmlns:r="http://schemas.openxmlformats.org/officeDocument/2006/relationships" xmlns:m="http://schemas.openxmlformats.org/officeDocument/2006/math" xmlns:v="urn:schemas-microsoft-com:vml" xmlns:wp14="http://schemas.microsoft.com/office/word/2010/wordprocessingDrawing" xmlns:wp="http://schemas.openxmlformats.org/drawingml/2006/wordprocessingDrawing" xmlns:w10="urn:schemas-microsoft-com:office:word" xmlns:w="http://schemas.openxmlformats.org/wordprocessingml/2006/main" xmlns:w14="http://schemas.microsoft.com/office/word/2010/wordml" xmlns:w15="http://schemas.microsoft.com/office/word/2012/wordml" xmlns:w16cex="http://schemas.microsoft.com/office/word/2018/wordml/cex" xmlns:w16cid="http://schemas.microsoft.com/office/word/2016/wordml/cid" xmlns:w16="http://schemas.microsoft.com/office/word/2018/wordml" xmlns:w16du="http://schemas.microsoft.com/office/word/2023/wordml/word16du" xmlns:w16sdtdh="http://schemas.microsoft.com/office/word/2020/wordml/sdtdatahash" xmlns:w16se="http://schemas.microsoft.com/office/word/2015/wordml/symex" xmlns:wpg="http://schemas.microsoft.com/office/word/2010/wordprocessingGroup" xmlns:wpi="http://schemas.microsoft.com/office/word/2010/wordprocessingInk" xmlns:wne="http://schemas.microsoft.com/office/word/2006/wordml" xmlns:wps="http://schemas.microsoft.com/office/word/2010/wordprocessingShape" mc:Ignorable="w14 w15 w16se w16cid w16 w16cex w16sdtdh wp14">
   <w:endnote w:type="separator" w:id="-1">
     <w:p>
       <w:r>
@@ -11187,7 +9914,7 @@
 </file>
 
 <file path=word/footnotes.xml><?xml version="1.0" encoding="utf-8"?>
-<w:footnotes xmlns:wpc="http://schemas.microsoft.com/office/word/2010/wordprocessingCanvas" xmlns:cx="http://schemas.microsoft.com/office/drawing/2014/chartex" xmlns:cx1="http://schemas.microsoft.com/office/drawing/2015/9/8/chartex" xmlns:cx2="http://schemas.microsoft.com/office/drawing/2015/10/21/chartex" xmlns:cx3="http://schemas.microsoft.com/office/drawing/2016/5/9/chartex" xmlns:cx4="http://schemas.microsoft.com/office/drawing/2016/5/10/chartex" xmlns:cx5="http://schemas.microsoft.com/office/drawing/2016/5/11/chartex" xmlns:cx6="http://schemas.microsoft.com/office/drawing/2016/5/12/chartex" xmlns:cx7="http://schemas.microsoft.com/office/drawing/2016/5/13/chartex" xmlns:cx8="http://schemas.microsoft.com/office/drawing/2016/5/14/chartex" xmlns:mc="http://schemas.openxmlformats.org/markup-compatibility/2006" xmlns:aink="http://schemas.microsoft.com/office/drawing/2016/ink" xmlns:am3d="http://schemas.microsoft.com/office/drawing/2017/model3d" xmlns:o="urn:schemas-microsoft-com:office:office" xmlns:oel="http://schemas.microsoft.com/office/2019/extlst" xmlns:r="http://schemas.openxmlformats.org/officeDocument/2006/relationships" xmlns:m="http://schemas.openxmlformats.org/officeDocument/2006/math" xmlns:v="urn:schemas-microsoft-com:vml" xmlns:wp14="http://schemas.microsoft.com/office/word/2010/wordprocessingDrawing" xmlns:wp="http://schemas.openxmlformats.org/drawingml/2006/wordprocessingDrawing" xmlns:w10="urn:schemas-microsoft-com:office:word" xmlns:w="http://schemas.openxmlformats.org/wordprocessingml/2006/main" xmlns:w14="http://schemas.microsoft.com/office/word/2010/wordml" xmlns:w15="http://schemas.microsoft.com/office/word/2012/wordml" xmlns:w16cex="http://schemas.microsoft.com/office/word/2018/wordml/cex" xmlns:w16cid="http://schemas.microsoft.com/office/word/2016/wordml/cid" xmlns:w16="http://schemas.microsoft.com/office/word/2018/wordml" xmlns:w16du="http://schemas.microsoft.com/office/word/2023/wordml/word16du" xmlns:w16sdtdh="http://schemas.microsoft.com/office/word/2020/wordml/sdtdatahash" xmlns:w16sdtfl="http://schemas.microsoft.com/office/word/2024/wordml/sdtformatlock" xmlns:w16se="http://schemas.microsoft.com/office/word/2015/wordml/symex" xmlns:wpg="http://schemas.microsoft.com/office/word/2010/wordprocessingGroup" xmlns:wpi="http://schemas.microsoft.com/office/word/2010/wordprocessingInk" xmlns:wne="http://schemas.microsoft.com/office/word/2006/wordml" xmlns:wps="http://schemas.microsoft.com/office/word/2010/wordprocessingShape" mc:Ignorable="w14 w15 w16se w16cid w16 w16cex w16sdtdh w16sdtfl w16du wp14">
+<w:footnotes xmlns:wpc="http://schemas.microsoft.com/office/word/2010/wordprocessingCanvas" xmlns:cx="http://schemas.microsoft.com/office/drawing/2014/chartex" xmlns:cx1="http://schemas.microsoft.com/office/drawing/2015/9/8/chartex" xmlns:cx2="http://schemas.microsoft.com/office/drawing/2015/10/21/chartex" xmlns:cx3="http://schemas.microsoft.com/office/drawing/2016/5/9/chartex" xmlns:cx4="http://schemas.microsoft.com/office/drawing/2016/5/10/chartex" xmlns:cx5="http://schemas.microsoft.com/office/drawing/2016/5/11/chartex" xmlns:cx6="http://schemas.microsoft.com/office/drawing/2016/5/12/chartex" xmlns:cx7="http://schemas.microsoft.com/office/drawing/2016/5/13/chartex" xmlns:cx8="http://schemas.microsoft.com/office/drawing/2016/5/14/chartex" xmlns:mc="http://schemas.openxmlformats.org/markup-compatibility/2006" xmlns:aink="http://schemas.microsoft.com/office/drawing/2016/ink" xmlns:am3d="http://schemas.microsoft.com/office/drawing/2017/model3d" xmlns:o="urn:schemas-microsoft-com:office:office" xmlns:oel="http://schemas.microsoft.com/office/2019/extlst" xmlns:r="http://schemas.openxmlformats.org/officeDocument/2006/relationships" xmlns:m="http://schemas.openxmlformats.org/officeDocument/2006/math" xmlns:v="urn:schemas-microsoft-com:vml" xmlns:wp14="http://schemas.microsoft.com/office/word/2010/wordprocessingDrawing" xmlns:wp="http://schemas.openxmlformats.org/drawingml/2006/wordprocessingDrawing" xmlns:w10="urn:schemas-microsoft-com:office:word" xmlns:w="http://schemas.openxmlformats.org/wordprocessingml/2006/main" xmlns:w14="http://schemas.microsoft.com/office/word/2010/wordml" xmlns:w15="http://schemas.microsoft.com/office/word/2012/wordml" xmlns:w16cex="http://schemas.microsoft.com/office/word/2018/wordml/cex" xmlns:w16cid="http://schemas.microsoft.com/office/word/2016/wordml/cid" xmlns:w16="http://schemas.microsoft.com/office/word/2018/wordml" xmlns:w16du="http://schemas.microsoft.com/office/word/2023/wordml/word16du" xmlns:w16sdtdh="http://schemas.microsoft.com/office/word/2020/wordml/sdtdatahash" xmlns:w16se="http://schemas.microsoft.com/office/word/2015/wordml/symex" xmlns:wpg="http://schemas.microsoft.com/office/word/2010/wordprocessingGroup" xmlns:wpi="http://schemas.microsoft.com/office/word/2010/wordprocessingInk" xmlns:wne="http://schemas.microsoft.com/office/word/2006/wordml" xmlns:wps="http://schemas.microsoft.com/office/word/2010/wordprocessingShape" mc:Ignorable="w14 w15 w16se w16cid w16 w16cex w16sdtdh wp14">
   <w:footnote w:type="separator" w:id="-1">
     <w:p>
       <w:r>
@@ -11206,7 +9933,7 @@
 </file>
 
 <file path=word/numbering.xml><?xml version="1.0" encoding="utf-8"?>
-<w:numbering xmlns:wpc="http://schemas.microsoft.com/office/word/2010/wordprocessingCanvas" xmlns:cx="http://schemas.microsoft.com/office/drawing/2014/chartex" xmlns:cx1="http://schemas.microsoft.com/office/drawing/2015/9/8/chartex" xmlns:cx2="http://schemas.microsoft.com/office/drawing/2015/10/21/chartex" xmlns:cx3="http://schemas.microsoft.com/office/drawing/2016/5/9/chartex" xmlns:cx4="http://schemas.microsoft.com/office/drawing/2016/5/10/chartex" xmlns:cx5="http://schemas.microsoft.com/office/drawing/2016/5/11/chartex" xmlns:cx6="http://schemas.microsoft.com/office/drawing/2016/5/12/chartex" xmlns:cx7="http://schemas.microsoft.com/office/drawing/2016/5/13/chartex" xmlns:cx8="http://schemas.microsoft.com/office/drawing/2016/5/14/chartex" xmlns:mc="http://schemas.openxmlformats.org/markup-compatibility/2006" xmlns:aink="http://schemas.microsoft.com/office/drawing/2016/ink" xmlns:am3d="http://schemas.microsoft.com/office/drawing/2017/model3d" xmlns:o="urn:schemas-microsoft-com:office:office" xmlns:oel="http://schemas.microsoft.com/office/2019/extlst" xmlns:r="http://schemas.openxmlformats.org/officeDocument/2006/relationships" xmlns:m="http://schemas.openxmlformats.org/officeDocument/2006/math" xmlns:v="urn:schemas-microsoft-com:vml" xmlns:wp14="http://schemas.microsoft.com/office/word/2010/wordprocessingDrawing" xmlns:wp="http://schemas.openxmlformats.org/drawingml/2006/wordprocessingDrawing" xmlns:w10="urn:schemas-microsoft-com:office:word" xmlns:w="http://schemas.openxmlformats.org/wordprocessingml/2006/main" xmlns:w14="http://schemas.microsoft.com/office/word/2010/wordml" xmlns:w15="http://schemas.microsoft.com/office/word/2012/wordml" xmlns:w16cex="http://schemas.microsoft.com/office/word/2018/wordml/cex" xmlns:w16cid="http://schemas.microsoft.com/office/word/2016/wordml/cid" xmlns:w16="http://schemas.microsoft.com/office/word/2018/wordml" xmlns:w16du="http://schemas.microsoft.com/office/word/2023/wordml/word16du" xmlns:w16sdtdh="http://schemas.microsoft.com/office/word/2020/wordml/sdtdatahash" xmlns:w16sdtfl="http://schemas.microsoft.com/office/word/2024/wordml/sdtformatlock" xmlns:w16se="http://schemas.microsoft.com/office/word/2015/wordml/symex" xmlns:wpg="http://schemas.microsoft.com/office/word/2010/wordprocessingGroup" xmlns:wpi="http://schemas.microsoft.com/office/word/2010/wordprocessingInk" xmlns:wne="http://schemas.microsoft.com/office/word/2006/wordml" xmlns:wps="http://schemas.microsoft.com/office/word/2010/wordprocessingShape" mc:Ignorable="w14 w15 w16se w16cid w16 w16cex w16sdtdh w16sdtfl w16du wp14">
+<w:numbering xmlns:wpc="http://schemas.microsoft.com/office/word/2010/wordprocessingCanvas" xmlns:cx="http://schemas.microsoft.com/office/drawing/2014/chartex" xmlns:cx1="http://schemas.microsoft.com/office/drawing/2015/9/8/chartex" xmlns:cx2="http://schemas.microsoft.com/office/drawing/2015/10/21/chartex" xmlns:cx3="http://schemas.microsoft.com/office/drawing/2016/5/9/chartex" xmlns:cx4="http://schemas.microsoft.com/office/drawing/2016/5/10/chartex" xmlns:cx5="http://schemas.microsoft.com/office/drawing/2016/5/11/chartex" xmlns:cx6="http://schemas.microsoft.com/office/drawing/2016/5/12/chartex" xmlns:cx7="http://schemas.microsoft.com/office/drawing/2016/5/13/chartex" xmlns:cx8="http://schemas.microsoft.com/office/drawing/2016/5/14/chartex" xmlns:mc="http://schemas.openxmlformats.org/markup-compatibility/2006" xmlns:aink="http://schemas.microsoft.com/office/drawing/2016/ink" xmlns:am3d="http://schemas.microsoft.com/office/drawing/2017/model3d" xmlns:o="urn:schemas-microsoft-com:office:office" xmlns:oel="http://schemas.microsoft.com/office/2019/extlst" xmlns:r="http://schemas.openxmlformats.org/officeDocument/2006/relationships" xmlns:m="http://schemas.openxmlformats.org/officeDocument/2006/math" xmlns:v="urn:schemas-microsoft-com:vml" xmlns:wp14="http://schemas.microsoft.com/office/word/2010/wordprocessingDrawing" xmlns:wp="http://schemas.openxmlformats.org/drawingml/2006/wordprocessingDrawing" xmlns:w10="urn:schemas-microsoft-com:office:word" xmlns:w="http://schemas.openxmlformats.org/wordprocessingml/2006/main" xmlns:w14="http://schemas.microsoft.com/office/word/2010/wordml" xmlns:w15="http://schemas.microsoft.com/office/word/2012/wordml" xmlns:w16cex="http://schemas.microsoft.com/office/word/2018/wordml/cex" xmlns:w16cid="http://schemas.microsoft.com/office/word/2016/wordml/cid" xmlns:w16="http://schemas.microsoft.com/office/word/2018/wordml" xmlns:w16du="http://schemas.microsoft.com/office/word/2023/wordml/word16du" xmlns:w16sdtdh="http://schemas.microsoft.com/office/word/2020/wordml/sdtdatahash" xmlns:w16se="http://schemas.microsoft.com/office/word/2015/wordml/symex" xmlns:wpg="http://schemas.microsoft.com/office/word/2010/wordprocessingGroup" xmlns:wpi="http://schemas.microsoft.com/office/word/2010/wordprocessingInk" xmlns:wne="http://schemas.microsoft.com/office/word/2006/wordml" xmlns:wps="http://schemas.microsoft.com/office/word/2010/wordprocessingShape" mc:Ignorable="w14 w15 w16se w16cid w16 w16cex w16sdtdh wp14">
   <w:abstractNum w:abstractNumId="0" w15:restartNumberingAfterBreak="0">
     <w:nsid w:val="00AE371F"/>
     <w:multiLevelType w:val="hybridMultilevel"/>
@@ -24305,7 +23032,7 @@
 </file>
 
 <file path=word/styles.xml><?xml version="1.0" encoding="utf-8"?>
-<w:styles xmlns:mc="http://schemas.openxmlformats.org/markup-compatibility/2006" xmlns:r="http://schemas.openxmlformats.org/officeDocument/2006/relationships" xmlns:w="http://schemas.openxmlformats.org/wordprocessingml/2006/main" xmlns:w14="http://schemas.microsoft.com/office/word/2010/wordml" xmlns:w15="http://schemas.microsoft.com/office/word/2012/wordml" xmlns:w16cex="http://schemas.microsoft.com/office/word/2018/wordml/cex" xmlns:w16cid="http://schemas.microsoft.com/office/word/2016/wordml/cid" xmlns:w16="http://schemas.microsoft.com/office/word/2018/wordml" xmlns:w16du="http://schemas.microsoft.com/office/word/2023/wordml/word16du" xmlns:w16sdtdh="http://schemas.microsoft.com/office/word/2020/wordml/sdtdatahash" xmlns:w16sdtfl="http://schemas.microsoft.com/office/word/2024/wordml/sdtformatlock" xmlns:w16se="http://schemas.microsoft.com/office/word/2015/wordml/symex" mc:Ignorable="w14 w15 w16se w16cid w16 w16cex w16sdtdh w16sdtfl w16du">
+<w:styles xmlns:mc="http://schemas.openxmlformats.org/markup-compatibility/2006" xmlns:r="http://schemas.openxmlformats.org/officeDocument/2006/relationships" xmlns:w="http://schemas.openxmlformats.org/wordprocessingml/2006/main" xmlns:w14="http://schemas.microsoft.com/office/word/2010/wordml" xmlns:w15="http://schemas.microsoft.com/office/word/2012/wordml" xmlns:w16cex="http://schemas.microsoft.com/office/word/2018/wordml/cex" xmlns:w16cid="http://schemas.microsoft.com/office/word/2016/wordml/cid" xmlns:w16="http://schemas.microsoft.com/office/word/2018/wordml" xmlns:w16sdtdh="http://schemas.microsoft.com/office/word/2020/wordml/sdtdatahash" xmlns:w16se="http://schemas.microsoft.com/office/word/2015/wordml/symex" mc:Ignorable="w14 w15 w16se w16cid w16 w16cex w16sdtdh">
   <w:docDefaults>
     <w:rPrDefault>
       <w:rPr>
@@ -24825,6 +23552,7 @@
   <w:style w:type="character" w:default="1" w:styleId="DefaultParagraphFont">
     <w:name w:val="Default Paragraph Font"/>
     <w:uiPriority w:val="1"/>
+    <w:semiHidden/>
     <w:unhideWhenUsed/>
   </w:style>
   <w:style w:type="table" w:default="1" w:styleId="TableNormal">

</xml_diff>